<commit_message>
Empty commit with no code changes made.
</commit_message>
<xml_diff>
--- a/Formatif 1.docx
+++ b/Formatif 1.docx
@@ -19,6 +19,7 @@
           <w:rFonts w:ascii="Times New Roman" w:hAnsi="Times New Roman" w:cs="Times New Roman"/>
           <w:b/>
           <w:bCs/>
+          <w:noProof/>
           <w:sz w:val="32"/>
           <w:szCs w:val="32"/>
         </w:rPr>
@@ -336,34 +337,19 @@
           <w:rFonts w:ascii="Times New Roman" w:hAnsi="Times New Roman" w:cs="Times New Roman"/>
           <w:b/>
           <w:bCs/>
+          <w:noProof/>
         </w:rPr>
         <w:lastRenderedPageBreak/>
-        <w:t>Flowchart:</w:t>
-      </w:r>
-      <w:r>
-        <w:rPr>
-          <w:rFonts w:ascii="Times New Roman" w:hAnsi="Times New Roman" w:cs="Times New Roman"/>
-          <w:b/>
-          <w:bCs/>
-        </w:rPr>
-        <w:br/>
-      </w:r>
-      <w:r>
-        <w:rPr>
-          <w:rFonts w:ascii="Times New Roman" w:hAnsi="Times New Roman" w:cs="Times New Roman"/>
-          <w:b/>
-          <w:bCs/>
-        </w:rPr>
         <w:drawing>
-          <wp:anchor distT="0" distB="0" distL="114300" distR="114300" simplePos="0" relativeHeight="251660800" behindDoc="0" locked="0" layoutInCell="1" allowOverlap="1" wp14:anchorId="2085C9E3" wp14:editId="479EDB24">
+          <wp:anchor distT="0" distB="0" distL="114300" distR="114300" simplePos="0" relativeHeight="251658240" behindDoc="0" locked="0" layoutInCell="1" allowOverlap="1" wp14:anchorId="2085C9E3" wp14:editId="4C2D30EC">
             <wp:simplePos x="0" y="0"/>
             <wp:positionH relativeFrom="page">
               <wp:posOffset>1143000</wp:posOffset>
             </wp:positionH>
             <wp:positionV relativeFrom="page">
-              <wp:posOffset>1402715</wp:posOffset>
+              <wp:posOffset>1400175</wp:posOffset>
             </wp:positionV>
-            <wp:extent cx="3286584" cy="7849695"/>
+            <wp:extent cx="3286125" cy="7849235"/>
             <wp:effectExtent l="0" t="0" r="9525" b="0"/>
             <wp:wrapSquare wrapText="bothSides"/>
             <wp:docPr id="173837496" name="Picture 1"/>
@@ -386,7 +372,7 @@
                   <pic:spPr>
                     <a:xfrm>
                       <a:off x="0" y="0"/>
-                      <a:ext cx="3286584" cy="7849695"/>
+                      <a:ext cx="3286125" cy="7849235"/>
                     </a:xfrm>
                     <a:prstGeom prst="rect">
                       <a:avLst/>
@@ -397,6 +383,22 @@
             </a:graphic>
           </wp:anchor>
         </w:drawing>
+      </w:r>
+      <w:r>
+        <w:rPr>
+          <w:rFonts w:ascii="Times New Roman" w:hAnsi="Times New Roman" w:cs="Times New Roman"/>
+          <w:b/>
+          <w:bCs/>
+        </w:rPr>
+        <w:t>Flowchart:</w:t>
+      </w:r>
+      <w:r>
+        <w:rPr>
+          <w:rFonts w:ascii="Times New Roman" w:hAnsi="Times New Roman" w:cs="Times New Roman"/>
+          <w:b/>
+          <w:bCs/>
+        </w:rPr>
+        <w:br/>
       </w:r>
       <w:r>
         <w:rPr>
@@ -634,23 +636,7 @@
           <w:rFonts w:ascii="Times New Roman" w:hAnsi="Times New Roman" w:cs="Times New Roman"/>
           <w:lang w:val="en-ID"/>
         </w:rPr>
-        <w:t xml:space="preserve">: Fungsi </w:t>
-      </w:r>
-      <w:proofErr w:type="gramStart"/>
-      <w:r>
-        <w:rPr>
-          <w:rFonts w:ascii="Times New Roman" w:hAnsi="Times New Roman" w:cs="Times New Roman"/>
-          <w:lang w:val="en-ID"/>
-        </w:rPr>
-        <w:t>input(</w:t>
-      </w:r>
-      <w:proofErr w:type="gramEnd"/>
-      <w:r>
-        <w:rPr>
-          <w:rFonts w:ascii="Times New Roman" w:hAnsi="Times New Roman" w:cs="Times New Roman"/>
-          <w:lang w:val="en-ID"/>
-        </w:rPr>
-        <w:t xml:space="preserve">) mengembalikan tipe data </w:t>
+        <w:t xml:space="preserve">: Fungsi input() mengembalikan tipe data </w:t>
       </w:r>
       <w:r>
         <w:rPr>
@@ -740,23 +726,7 @@
           <w:rFonts w:ascii="Times New Roman" w:hAnsi="Times New Roman" w:cs="Times New Roman"/>
           <w:lang w:val="en-ID"/>
         </w:rPr>
-        <w:t xml:space="preserve">: Penggabungan string dan variabel dalam </w:t>
-      </w:r>
-      <w:proofErr w:type="gramStart"/>
-      <w:r>
-        <w:rPr>
-          <w:rFonts w:ascii="Times New Roman" w:hAnsi="Times New Roman" w:cs="Times New Roman"/>
-          <w:lang w:val="en-ID"/>
-        </w:rPr>
-        <w:t>print(</w:t>
-      </w:r>
-      <w:proofErr w:type="gramEnd"/>
-      <w:r>
-        <w:rPr>
-          <w:rFonts w:ascii="Times New Roman" w:hAnsi="Times New Roman" w:cs="Times New Roman"/>
-          <w:lang w:val="en-ID"/>
-        </w:rPr>
-        <w:t>) bisa lebih rapi.</w:t>
+        <w:t>: Penggabungan string dan variabel dalam print() bisa lebih rapi.</w:t>
       </w:r>
     </w:p>
     <w:p>
@@ -794,6 +764,7 @@
           <w:rFonts w:ascii="Times New Roman" w:hAnsi="Times New Roman" w:cs="Times New Roman"/>
           <w:b/>
           <w:bCs/>
+          <w:noProof/>
           <w:lang w:val="en-ID"/>
         </w:rPr>
         <w:drawing>
@@ -932,6 +903,17 @@
           <w:bCs/>
         </w:rPr>
       </w:pPr>
+      <w:hyperlink r:id="rId9" w:history="1">
+        <w:r>
+          <w:rPr>
+            <w:rStyle w:val="Hyperlink"/>
+            <w:rFonts w:ascii="Times New Roman" w:hAnsi="Times New Roman" w:cs="Times New Roman"/>
+            <w:b/>
+            <w:bCs/>
+          </w:rPr>
+          <w:t>https://github.com/Denmasmolano21/tugas_semester_1/blob/main/formatif1.py</w:t>
+        </w:r>
+      </w:hyperlink>
     </w:p>
     <w:p>
       <w:pPr>
@@ -960,6 +942,17 @@
           <w:bCs/>
         </w:rPr>
       </w:pPr>
+      <w:hyperlink r:id="rId10" w:history="1">
+        <w:r>
+          <w:rPr>
+            <w:rStyle w:val="Hyperlink"/>
+            <w:rFonts w:ascii="Times New Roman" w:hAnsi="Times New Roman" w:cs="Times New Roman"/>
+            <w:b/>
+            <w:bCs/>
+          </w:rPr>
+          <w:t>https://github.com/Denmasmolano21/tugas_semester_1/blob/main/formatif1a.py</w:t>
+        </w:r>
+      </w:hyperlink>
     </w:p>
     <w:sectPr>
       <w:pgSz w:w="12240" w:h="15840"/>
@@ -1893,6 +1886,7 @@
   <w:style w:type="character" w:default="1" w:styleId="DefaultParagraphFont">
     <w:name w:val="Default Paragraph Font"/>
     <w:uiPriority w:val="1"/>
+    <w:semiHidden/>
     <w:unhideWhenUsed/>
   </w:style>
   <w:style w:type="table" w:default="1" w:styleId="TableNormal">
@@ -12668,6 +12662,29 @@
         <w:shd w:val="clear" w:color="auto" w:fill="FBCAA2" w:themeFill="accent6" w:themeFillTint="7F"/>
       </w:tcPr>
     </w:tblStylePr>
+  </w:style>
+  <w:style w:type="character" w:styleId="Hyperlink">
+    <w:name w:val="Hyperlink"/>
+    <w:basedOn w:val="DefaultParagraphFont"/>
+    <w:uiPriority w:val="99"/>
+    <w:unhideWhenUsed/>
+    <w:rsid w:val="002249C6"/>
+    <w:rPr>
+      <w:color w:val="0000FF" w:themeColor="hyperlink"/>
+      <w:u w:val="single"/>
+    </w:rPr>
+  </w:style>
+  <w:style w:type="character" w:styleId="UnresolvedMention">
+    <w:name w:val="Unresolved Mention"/>
+    <w:basedOn w:val="DefaultParagraphFont"/>
+    <w:uiPriority w:val="99"/>
+    <w:semiHidden/>
+    <w:unhideWhenUsed/>
+    <w:rsid w:val="002249C6"/>
+    <w:rPr>
+      <w:color w:val="605E5C"/>
+      <w:shd w:val="clear" w:color="auto" w:fill="E1DFDD"/>
+    </w:rPr>
   </w:style>
 </w:styles>
 </file>

</xml_diff>